<commit_message>
Lots of script for creating presentation plots
</commit_message>
<xml_diff>
--- a/General Calculations.docx
+++ b/General Calculations.docx
@@ -364,20 +364,49 @@
         <w:rPr>
           <w:rFonts w:eastAsiaTheme="minorEastAsia"/>
         </w:rPr>
-        <w:t>Where n</w:t>
+        <w:t xml:space="preserve">Where </w:t>
+      </w:r>
+      <w:proofErr w:type="spellStart"/>
+      <w:r>
+        <w:rPr>
+          <w:rFonts w:eastAsiaTheme="minorEastAsia"/>
+        </w:rPr>
+        <w:t>n</w:t>
       </w:r>
       <w:r>
         <w:rPr>
           <w:rFonts w:eastAsiaTheme="minorEastAsia"/>
           <w:vertAlign w:val="subscript"/>
         </w:rPr>
-        <w:t xml:space="preserve">i </w:t>
+        <w:t>i</w:t>
+      </w:r>
+      <w:proofErr w:type="spellEnd"/>
+      <w:r>
+        <w:rPr>
+          <w:rFonts w:eastAsiaTheme="minorEastAsia"/>
+          <w:vertAlign w:val="subscript"/>
+        </w:rPr>
+        <w:t xml:space="preserve"> </w:t>
       </w:r>
       <w:r>
         <w:rPr>
           <w:rFonts w:eastAsiaTheme="minorEastAsia"/>
         </w:rPr>
-        <w:t xml:space="preserve">is the number of molecules of the gas </w:t>
+        <w:t xml:space="preserve">is the number of molecules of </w:t>
+      </w:r>
+      <w:proofErr w:type="gramStart"/>
+      <w:r>
+        <w:rPr>
+          <w:rFonts w:eastAsiaTheme="minorEastAsia"/>
+        </w:rPr>
+        <w:t>the gas</w:t>
+      </w:r>
+      <w:proofErr w:type="gramEnd"/>
+      <w:r>
+        <w:rPr>
+          <w:rFonts w:eastAsiaTheme="minorEastAsia"/>
+        </w:rPr>
+        <w:t xml:space="preserve"> </w:t>
       </w:r>
       <w:r>
         <w:rPr>
@@ -401,7 +430,14 @@
         <w:rPr>
           <w:rFonts w:eastAsiaTheme="minorEastAsia"/>
         </w:rPr>
-        <w:t>volume and n</w:t>
+        <w:t xml:space="preserve">volume and </w:t>
+      </w:r>
+      <w:proofErr w:type="spellStart"/>
+      <w:r>
+        <w:rPr>
+          <w:rFonts w:eastAsiaTheme="minorEastAsia"/>
+        </w:rPr>
+        <w:t>n</w:t>
       </w:r>
       <w:r>
         <w:rPr>
@@ -410,6 +446,7 @@
         </w:rPr>
         <w:t>total</w:t>
       </w:r>
+      <w:proofErr w:type="spellEnd"/>
       <w:r>
         <w:rPr>
           <w:rFonts w:eastAsiaTheme="minorEastAsia"/>
@@ -432,7 +469,28 @@
         <w:rPr>
           <w:rFonts w:eastAsiaTheme="minorEastAsia"/>
         </w:rPr>
-        <w:t xml:space="preserve"> According to the ideal gas law (PV=nRT), the concentration can be expressed by the partial pressure p</w:t>
+        <w:t xml:space="preserve"> According to the ideal gas law (PV=</w:t>
+      </w:r>
+      <w:proofErr w:type="spellStart"/>
+      <w:r>
+        <w:rPr>
+          <w:rFonts w:eastAsiaTheme="minorEastAsia"/>
+        </w:rPr>
+        <w:t>nRT</w:t>
+      </w:r>
+      <w:proofErr w:type="spellEnd"/>
+      <w:r>
+        <w:rPr>
+          <w:rFonts w:eastAsiaTheme="minorEastAsia"/>
+        </w:rPr>
+        <w:t xml:space="preserve">), the concentration can be expressed by the partial pressure </w:t>
+      </w:r>
+      <w:proofErr w:type="spellStart"/>
+      <w:r>
+        <w:rPr>
+          <w:rFonts w:eastAsiaTheme="minorEastAsia"/>
+        </w:rPr>
+        <w:t>p</w:t>
       </w:r>
       <w:r>
         <w:rPr>
@@ -441,11 +499,19 @@
         </w:rPr>
         <w:t>A</w:t>
       </w:r>
+      <w:proofErr w:type="spellEnd"/>
       <w:r>
         <w:rPr>
           <w:rFonts w:eastAsiaTheme="minorEastAsia"/>
         </w:rPr>
-        <w:t xml:space="preserve"> relative to the total pressure P</w:t>
+        <w:t xml:space="preserve"> relative to the total pressure </w:t>
+      </w:r>
+      <w:proofErr w:type="spellStart"/>
+      <w:r>
+        <w:rPr>
+          <w:rFonts w:eastAsiaTheme="minorEastAsia"/>
+        </w:rPr>
+        <w:t>P</w:t>
       </w:r>
       <w:r>
         <w:rPr>
@@ -454,6 +520,7 @@
         </w:rPr>
         <w:t>total</w:t>
       </w:r>
+      <w:proofErr w:type="spellEnd"/>
       <w:r>
         <w:rPr>
           <w:rFonts w:eastAsiaTheme="minorEastAsia"/>
@@ -545,7 +612,21 @@
         <w:rPr>
           <w:rFonts w:eastAsiaTheme="minorEastAsia"/>
         </w:rPr>
-        <w:t>From the ideal gas law we know that the total number of molecules</w:t>
+        <w:t xml:space="preserve">From the ideal gas </w:t>
+      </w:r>
+      <w:proofErr w:type="gramStart"/>
+      <w:r>
+        <w:rPr>
+          <w:rFonts w:eastAsiaTheme="minorEastAsia"/>
+        </w:rPr>
+        <w:t>law</w:t>
+      </w:r>
+      <w:proofErr w:type="gramEnd"/>
+      <w:r>
+        <w:rPr>
+          <w:rFonts w:eastAsiaTheme="minorEastAsia"/>
+        </w:rPr>
+        <w:t xml:space="preserve"> we know that the total number of molecules</w:t>
       </w:r>
       <w:r>
         <w:rPr>
@@ -677,11 +758,19 @@
           <w:iCs/>
         </w:rPr>
       </w:pPr>
+      <w:proofErr w:type="gramStart"/>
       <w:r>
         <w:rPr>
           <w:iCs/>
         </w:rPr>
-        <w:t>Hence we can calculate the concentration in moles of A per volume V from C(ppm):</w:t>
+        <w:t>Hence</w:t>
+      </w:r>
+      <w:proofErr w:type="gramEnd"/>
+      <w:r>
+        <w:rPr>
+          <w:iCs/>
+        </w:rPr>
+        <w:t xml:space="preserve"> we can calculate the concentration in moles of A per volume V from C(ppm):</w:t>
       </w:r>
     </w:p>
     <w:p>
@@ -3518,7 +3607,27 @@
           <w:sz w:val="20"/>
           <w:szCs w:val="20"/>
         </w:rPr>
-        <w:t xml:space="preserve">3 being an emperical constant for the system </w:t>
+        <w:t xml:space="preserve">3 being an </w:t>
+      </w:r>
+      <w:proofErr w:type="spellStart"/>
+      <w:r>
+        <w:rPr>
+          <w:rFonts w:eastAsiaTheme="minorEastAsia"/>
+          <w:iCs/>
+          <w:sz w:val="20"/>
+          <w:szCs w:val="20"/>
+        </w:rPr>
+        <w:t>emperical</w:t>
+      </w:r>
+      <w:proofErr w:type="spellEnd"/>
+      <w:r>
+        <w:rPr>
+          <w:rFonts w:eastAsiaTheme="minorEastAsia"/>
+          <w:iCs/>
+          <w:sz w:val="20"/>
+          <w:szCs w:val="20"/>
+        </w:rPr>
+        <w:t xml:space="preserve"> constant for the system </w:t>
       </w:r>
     </w:p>
     <w:p>
@@ -5852,10 +5961,7 @@
           </w:tcPr>
           <w:p>
             <w:r>
-              <w:t>F</w:t>
-            </w:r>
-            <w:r>
-              <w:t>i</w:t>
+              <w:t>Fi</w:t>
             </w:r>
           </w:p>
         </w:tc>
@@ -5864,8 +5970,13 @@
             <w:tcW w:w="1982" w:type="dxa"/>
           </w:tcPr>
           <w:p>
+            <w:proofErr w:type="spellStart"/>
             <w:r>
-              <w:t xml:space="preserve">Dist </w:t>
+              <w:t>Dist</w:t>
+            </w:r>
+            <w:proofErr w:type="spellEnd"/>
+            <w:r>
+              <w:t xml:space="preserve"> </w:t>
             </w:r>
           </w:p>
         </w:tc>
@@ -5886,13 +5997,15 @@
                     <m:ctrlPr>
                       <w:rPr>
                         <w:rFonts w:ascii="Cambria Math" w:hAnsi="Cambria Math"/>
-                        <w:i/>
                         <w:vertAlign w:val="superscript"/>
                       </w:rPr>
                     </m:ctrlPr>
                   </m:sSubPr>
                   <m:e>
                     <m:r>
+                      <m:rPr>
+                        <m:sty m:val="p"/>
+                      </m:rPr>
                       <w:rPr>
                         <w:rFonts w:ascii="Cambria Math" w:hAnsi="Cambria Math"/>
                         <w:vertAlign w:val="superscript"/>
@@ -5902,6 +6015,9 @@
                   </m:e>
                   <m:sub>
                     <m:r>
+                      <m:rPr>
+                        <m:sty m:val="p"/>
+                      </m:rPr>
                       <w:rPr>
                         <w:rFonts w:ascii="Cambria Math" w:hAnsi="Cambria Math"/>
                         <w:vertAlign w:val="superscript"/>
@@ -5911,6 +6027,9 @@
                   </m:sub>
                 </m:sSub>
                 <m:r>
+                  <m:rPr>
+                    <m:sty m:val="p"/>
+                  </m:rPr>
                   <w:rPr>
                     <w:rFonts w:ascii="Cambria Math" w:hAnsi="Cambria Math"/>
                     <w:vertAlign w:val="superscript"/>
@@ -6007,13 +6126,15 @@
                     <m:ctrlPr>
                       <w:rPr>
                         <w:rFonts w:ascii="Cambria Math" w:eastAsia="Times New Roman" w:hAnsi="Cambria Math" w:cs="Times New Roman"/>
-                        <w:i/>
                         <w:vertAlign w:val="superscript"/>
                       </w:rPr>
                     </m:ctrlPr>
                   </m:sSubSupPr>
                   <m:e>
                     <m:r>
+                      <m:rPr>
+                        <m:sty m:val="p"/>
+                      </m:rPr>
                       <w:rPr>
                         <w:rFonts w:ascii="Cambria Math" w:eastAsia="Times New Roman" w:hAnsi="Cambria Math" w:cs="Times New Roman"/>
                         <w:vertAlign w:val="superscript"/>
@@ -6023,6 +6144,9 @@
                   </m:e>
                   <m:sub>
                     <m:r>
+                      <m:rPr>
+                        <m:sty m:val="p"/>
+                      </m:rPr>
                       <w:rPr>
                         <w:rFonts w:ascii="Cambria Math" w:eastAsia="Times New Roman" w:hAnsi="Cambria Math" w:cs="Times New Roman"/>
                         <w:vertAlign w:val="superscript"/>
@@ -6032,6 +6156,9 @@
                   </m:sub>
                   <m:sup>
                     <m:r>
+                      <m:rPr>
+                        <m:sty m:val="p"/>
+                      </m:rPr>
                       <w:rPr>
                         <w:rFonts w:ascii="Cambria Math" w:eastAsia="Times New Roman" w:hAnsi="Cambria Math" w:cs="Times New Roman"/>
                         <w:vertAlign w:val="superscript"/>
@@ -6041,6 +6168,9 @@
                   </m:sup>
                 </m:sSubSup>
                 <m:r>
+                  <m:rPr>
+                    <m:sty m:val="p"/>
+                  </m:rPr>
                   <w:rPr>
                     <w:rFonts w:ascii="Cambria Math" w:eastAsia="Times New Roman" w:hAnsi="Cambria Math" w:cs="Times New Roman"/>
                     <w:vertAlign w:val="superscript"/>
@@ -6052,7 +6182,6 @@
                     <m:ctrlPr>
                       <w:rPr>
                         <w:rFonts w:ascii="Cambria Math" w:eastAsia="Times New Roman" w:hAnsi="Cambria Math" w:cs="Times New Roman"/>
-                        <w:i/>
                         <w:vertAlign w:val="superscript"/>
                       </w:rPr>
                     </m:ctrlPr>
@@ -6063,13 +6192,15 @@
                         <m:ctrlPr>
                           <w:rPr>
                             <w:rFonts w:ascii="Cambria Math" w:eastAsia="Times New Roman" w:hAnsi="Cambria Math" w:cs="Times New Roman"/>
-                            <w:i/>
                             <w:vertAlign w:val="superscript"/>
                           </w:rPr>
                         </m:ctrlPr>
                       </m:sSubPr>
                       <m:e>
                         <m:r>
+                          <m:rPr>
+                            <m:sty m:val="p"/>
+                          </m:rPr>
                           <w:rPr>
                             <w:rFonts w:ascii="Cambria Math" w:eastAsia="Times New Roman" w:hAnsi="Cambria Math" w:cs="Times New Roman"/>
                             <w:vertAlign w:val="superscript"/>
@@ -6079,6 +6210,9 @@
                       </m:e>
                       <m:sub>
                         <m:r>
+                          <m:rPr>
+                            <m:sty m:val="p"/>
+                          </m:rPr>
                           <w:rPr>
                             <w:rFonts w:ascii="Cambria Math" w:eastAsia="Times New Roman" w:hAnsi="Cambria Math" w:cs="Times New Roman"/>
                             <w:vertAlign w:val="superscript"/>
@@ -6098,7 +6232,6 @@
                         <m:ctrlPr>
                           <w:rPr>
                             <w:rFonts w:ascii="Cambria Math" w:eastAsiaTheme="minorEastAsia" w:hAnsi="Cambria Math"/>
-                            <w:i/>
                           </w:rPr>
                         </m:ctrlPr>
                       </m:naryPr>
@@ -6110,12 +6243,14 @@
                             <m:ctrlPr>
                               <w:rPr>
                                 <w:rFonts w:ascii="Cambria Math" w:eastAsiaTheme="minorEastAsia" w:hAnsi="Cambria Math"/>
-                                <w:i/>
                               </w:rPr>
                             </m:ctrlPr>
                           </m:sSubPr>
                           <m:e>
                             <m:r>
+                              <m:rPr>
+                                <m:sty m:val="p"/>
+                              </m:rPr>
                               <w:rPr>
                                 <w:rFonts w:ascii="Cambria Math" w:eastAsiaTheme="minorEastAsia" w:hAnsi="Cambria Math"/>
                               </w:rPr>
@@ -6124,6 +6259,9 @@
                           </m:e>
                           <m:sub>
                             <m:r>
+                              <m:rPr>
+                                <m:sty m:val="p"/>
+                              </m:rPr>
                               <w:rPr>
                                 <w:rFonts w:ascii="Cambria Math" w:eastAsiaTheme="minorEastAsia" w:hAnsi="Cambria Math"/>
                               </w:rPr>
@@ -6157,13 +6295,15 @@
                     <m:ctrlPr>
                       <w:rPr>
                         <w:rFonts w:ascii="Cambria Math" w:eastAsia="Times New Roman" w:hAnsi="Cambria Math" w:cs="Times New Roman"/>
-                        <w:i/>
                         <w:vertAlign w:val="superscript"/>
                       </w:rPr>
                     </m:ctrlPr>
                   </m:sSubSupPr>
                   <m:e>
                     <m:r>
+                      <m:rPr>
+                        <m:sty m:val="p"/>
+                      </m:rPr>
                       <w:rPr>
                         <w:rFonts w:ascii="Cambria Math" w:eastAsia="Times New Roman" w:hAnsi="Cambria Math" w:cs="Times New Roman"/>
                         <w:vertAlign w:val="superscript"/>
@@ -6173,6 +6313,9 @@
                   </m:e>
                   <m:sub>
                     <m:r>
+                      <m:rPr>
+                        <m:sty m:val="p"/>
+                      </m:rPr>
                       <w:rPr>
                         <w:rFonts w:ascii="Cambria Math" w:eastAsia="Times New Roman" w:hAnsi="Cambria Math" w:cs="Times New Roman"/>
                         <w:vertAlign w:val="superscript"/>
@@ -6182,6 +6325,9 @@
                   </m:sub>
                   <m:sup>
                     <m:r>
+                      <m:rPr>
+                        <m:sty m:val="p"/>
+                      </m:rPr>
                       <w:rPr>
                         <w:rFonts w:ascii="Cambria Math" w:eastAsia="Times New Roman" w:hAnsi="Cambria Math" w:cs="Times New Roman"/>
                         <w:vertAlign w:val="superscript"/>
@@ -6191,6 +6337,9 @@
                   </m:sup>
                 </m:sSubSup>
                 <m:r>
+                  <m:rPr>
+                    <m:sty m:val="p"/>
+                  </m:rPr>
                   <w:rPr>
                     <w:rFonts w:ascii="Cambria Math" w:eastAsia="Times New Roman" w:hAnsi="Cambria Math" w:cs="Times New Roman"/>
                     <w:vertAlign w:val="superscript"/>
@@ -6202,13 +6351,15 @@
                     <m:ctrlPr>
                       <w:rPr>
                         <w:rFonts w:ascii="Cambria Math" w:eastAsia="Times New Roman" w:hAnsi="Cambria Math" w:cs="Times New Roman"/>
-                        <w:i/>
                         <w:vertAlign w:val="superscript"/>
                       </w:rPr>
                     </m:ctrlPr>
                   </m:sSubSupPr>
                   <m:e>
                     <m:r>
+                      <m:rPr>
+                        <m:sty m:val="p"/>
+                      </m:rPr>
                       <w:rPr>
                         <w:rFonts w:ascii="Cambria Math" w:eastAsia="Times New Roman" w:hAnsi="Cambria Math" w:cs="Times New Roman"/>
                         <w:vertAlign w:val="superscript"/>
@@ -6218,6 +6369,9 @@
                   </m:e>
                   <m:sub>
                     <m:r>
+                      <m:rPr>
+                        <m:sty m:val="p"/>
+                      </m:rPr>
                       <w:rPr>
                         <w:rFonts w:ascii="Cambria Math" w:eastAsia="Times New Roman" w:hAnsi="Cambria Math" w:cs="Times New Roman"/>
                         <w:vertAlign w:val="superscript"/>
@@ -6227,6 +6381,9 @@
                   </m:sub>
                   <m:sup>
                     <m:r>
+                      <m:rPr>
+                        <m:sty m:val="p"/>
+                      </m:rPr>
                       <w:rPr>
                         <w:rFonts w:ascii="Cambria Math" w:eastAsia="Times New Roman" w:hAnsi="Cambria Math" w:cs="Times New Roman"/>
                         <w:vertAlign w:val="superscript"/>
@@ -6431,7 +6588,6 @@
               <m:ctrlPr>
                 <w:rPr>
                   <w:rFonts w:ascii="Cambria Math" w:eastAsiaTheme="minorEastAsia" w:hAnsi="Cambria Math"/>
-                  <w:i/>
                 </w:rPr>
               </m:ctrlPr>
             </m:naryPr>
@@ -6443,12 +6599,14 @@
                   <m:ctrlPr>
                     <w:rPr>
                       <w:rFonts w:ascii="Cambria Math" w:eastAsiaTheme="minorEastAsia" w:hAnsi="Cambria Math"/>
-                      <w:i/>
                     </w:rPr>
                   </m:ctrlPr>
                 </m:sSubPr>
                 <m:e>
                   <m:r>
+                    <m:rPr>
+                      <m:sty m:val="p"/>
+                    </m:rPr>
                     <w:rPr>
                       <w:rFonts w:ascii="Cambria Math" w:eastAsiaTheme="minorEastAsia" w:hAnsi="Cambria Math"/>
                     </w:rPr>
@@ -6457,6 +6615,9 @@
                 </m:e>
                 <m:sub>
                   <m:r>
+                    <m:rPr>
+                      <m:sty m:val="p"/>
+                    </m:rPr>
                     <w:rPr>
                       <w:rFonts w:ascii="Cambria Math" w:eastAsiaTheme="minorEastAsia" w:hAnsi="Cambria Math"/>
                     </w:rPr>
@@ -6467,12 +6628,18 @@
             </m:e>
           </m:nary>
           <m:r>
+            <m:rPr>
+              <m:sty m:val="p"/>
+            </m:rPr>
             <w:rPr>
               <w:rFonts w:ascii="Cambria Math" w:eastAsiaTheme="minorEastAsia" w:hAnsi="Cambria Math"/>
             </w:rPr>
             <m:t xml:space="preserve">= </m:t>
           </m:r>
           <m:r>
+            <m:rPr>
+              <m:sty m:val="p"/>
+            </m:rPr>
             <w:rPr>
               <w:rFonts w:ascii="Cambria Math" w:hAnsi="Cambria Math"/>
             </w:rPr>
@@ -6503,16 +6670,13 @@
       <m:oMathPara>
         <m:oMath>
           <m:r>
+            <m:rPr>
+              <m:sty m:val="p"/>
+            </m:rPr>
             <w:rPr>
               <w:rFonts w:ascii="Cambria Math" w:hAnsi="Cambria Math"/>
             </w:rPr>
-            <m:t>1.470+0.155+0.046</m:t>
-          </m:r>
-          <m:r>
-            <w:rPr>
-              <w:rFonts w:ascii="Cambria Math" w:hAnsi="Cambria Math"/>
-            </w:rPr>
-            <m:t>=1.671</m:t>
+            <m:t>1.470+0.155+0.046=1.671</m:t>
           </m:r>
         </m:oMath>
       </m:oMathPara>
@@ -6525,12 +6689,14 @@
               <m:ctrlPr>
                 <w:rPr>
                   <w:rFonts w:ascii="Cambria Math" w:hAnsi="Cambria Math"/>
-                  <w:i/>
                 </w:rPr>
               </m:ctrlPr>
             </m:sSubPr>
             <m:e>
               <m:r>
+                <m:rPr>
+                  <m:sty m:val="p"/>
+                </m:rPr>
                 <w:rPr>
                   <w:rFonts w:ascii="Cambria Math" w:hAnsi="Cambria Math"/>
                 </w:rPr>
@@ -6539,6 +6705,9 @@
             </m:e>
             <m:sub>
               <m:r>
+                <m:rPr>
+                  <m:sty m:val="p"/>
+                </m:rPr>
                 <w:rPr>
                   <w:rFonts w:ascii="Cambria Math" w:hAnsi="Cambria Math"/>
                 </w:rPr>
@@ -6547,16 +6716,13 @@
             </m:sub>
           </m:sSub>
           <m:r>
+            <m:rPr>
+              <m:sty m:val="p"/>
+            </m:rPr>
             <w:rPr>
               <w:rFonts w:ascii="Cambria Math" w:hAnsi="Cambria Math"/>
             </w:rPr>
-            <m:t>=1.73-1.671</m:t>
-          </m:r>
-          <m:r>
-            <w:rPr>
-              <w:rFonts w:ascii="Cambria Math" w:hAnsi="Cambria Math"/>
-            </w:rPr>
-            <m:t>=0.06</m:t>
+            <m:t>=1.73-1.671=0.06</m:t>
           </m:r>
         </m:oMath>
       </m:oMathPara>
@@ -8550,7 +8716,15 @@
     </w:p>
     <w:p>
       <w:r>
-        <w:t>Start from ficks law</w:t>
+        <w:t xml:space="preserve">Start from </w:t>
+      </w:r>
+      <w:proofErr w:type="spellStart"/>
+      <w:r>
+        <w:t>ficks</w:t>
+      </w:r>
+      <w:proofErr w:type="spellEnd"/>
+      <w:r>
+        <w:t xml:space="preserve"> law</w:t>
       </w:r>
       <w:r>
         <w:t>, air side</w:t>
@@ -9002,13 +9176,7 @@
                     <w:rPr>
                       <w:rFonts w:ascii="Cambria Math" w:hAnsi="Cambria Math"/>
                     </w:rPr>
-                    <m:t>a</m:t>
-                  </m:r>
-                  <m:r>
-                    <w:rPr>
-                      <w:rFonts w:ascii="Cambria Math" w:hAnsi="Cambria Math"/>
-                    </w:rPr>
-                    <m:t>, i</m:t>
+                    <m:t>a, i</m:t>
                   </m:r>
                 </m:sub>
               </m:sSub>
@@ -9040,19 +9208,7 @@
                     <w:rPr>
                       <w:rFonts w:ascii="Cambria Math" w:hAnsi="Cambria Math"/>
                     </w:rPr>
-                    <m:t>a</m:t>
-                  </m:r>
-                  <m:r>
-                    <w:rPr>
-                      <w:rFonts w:ascii="Cambria Math" w:hAnsi="Cambria Math"/>
-                    </w:rPr>
-                    <m:t xml:space="preserve">, </m:t>
-                  </m:r>
-                  <m:r>
-                    <w:rPr>
-                      <w:rFonts w:ascii="Cambria Math" w:hAnsi="Cambria Math"/>
-                    </w:rPr>
-                    <m:t>b</m:t>
+                    <m:t>a, b</m:t>
                   </m:r>
                 </m:sub>
               </m:sSub>
@@ -9145,19 +9301,7 @@
                     <w:rPr>
                       <w:rFonts w:ascii="Cambria Math" w:hAnsi="Cambria Math"/>
                     </w:rPr>
-                    <m:t>w</m:t>
-                  </m:r>
-                  <m:r>
-                    <w:rPr>
-                      <w:rFonts w:ascii="Cambria Math" w:hAnsi="Cambria Math"/>
-                    </w:rPr>
-                    <m:t xml:space="preserve">, </m:t>
-                  </m:r>
-                  <m:r>
-                    <w:rPr>
-                      <w:rFonts w:ascii="Cambria Math" w:hAnsi="Cambria Math"/>
-                    </w:rPr>
-                    <m:t xml:space="preserve"> b</m:t>
+                    <m:t>w,  b</m:t>
                   </m:r>
                 </m:sub>
               </m:sSub>
@@ -9189,19 +9333,7 @@
                     <w:rPr>
                       <w:rFonts w:ascii="Cambria Math" w:hAnsi="Cambria Math"/>
                     </w:rPr>
-                    <m:t>w</m:t>
-                  </m:r>
-                  <m:r>
-                    <w:rPr>
-                      <w:rFonts w:ascii="Cambria Math" w:hAnsi="Cambria Math"/>
-                    </w:rPr>
-                    <m:t xml:space="preserve">, </m:t>
-                  </m:r>
-                  <m:r>
-                    <w:rPr>
-                      <w:rFonts w:ascii="Cambria Math" w:hAnsi="Cambria Math"/>
-                    </w:rPr>
-                    <m:t>i</m:t>
+                    <m:t>w, i</m:t>
                   </m:r>
                 </m:sub>
               </m:sSub>
@@ -9311,16 +9443,7 @@
                 <w:rPr>
                   <w:rFonts w:ascii="Cambria Math" w:hAnsi="Cambria Math"/>
                 </w:rPr>
-                <m:t>a</m:t>
-              </m:r>
-              <m:r>
-                <m:rPr>
-                  <m:sty m:val="p"/>
-                </m:rPr>
-                <w:rPr>
-                  <w:rFonts w:ascii="Cambria Math" w:hAnsi="Cambria Math"/>
-                </w:rPr>
-                <m:t>, i</m:t>
+                <m:t>a, i</m:t>
               </m:r>
             </m:sub>
           </m:sSub>
@@ -9425,16 +9548,7 @@
                 <w:rPr>
                   <w:rFonts w:ascii="Cambria Math" w:eastAsiaTheme="minorEastAsia" w:hAnsi="Cambria Math"/>
                 </w:rPr>
-                <m:t>a</m:t>
-              </m:r>
-              <m:r>
-                <m:rPr>
-                  <m:sty m:val="p"/>
-                </m:rPr>
-                <w:rPr>
-                  <w:rFonts w:ascii="Cambria Math" w:eastAsiaTheme="minorEastAsia" w:hAnsi="Cambria Math"/>
-                </w:rPr>
-                <m:t>,b</m:t>
+                <m:t>a,b</m:t>
               </m:r>
             </m:sub>
           </m:sSub>
@@ -9528,13 +9642,7 @@
                     <w:rPr>
                       <w:rFonts w:ascii="Cambria Math" w:hAnsi="Cambria Math"/>
                     </w:rPr>
-                    <m:t>w</m:t>
-                  </m:r>
-                  <m:r>
-                    <w:rPr>
-                      <w:rFonts w:ascii="Cambria Math" w:hAnsi="Cambria Math"/>
-                    </w:rPr>
-                    <m:t>,  b</m:t>
+                    <m:t>w,  b</m:t>
                   </m:r>
                 </m:sub>
               </m:sSub>
@@ -9566,13 +9674,7 @@
                     <w:rPr>
                       <w:rFonts w:ascii="Cambria Math" w:hAnsi="Cambria Math"/>
                     </w:rPr>
-                    <m:t>w</m:t>
-                  </m:r>
-                  <m:r>
-                    <w:rPr>
-                      <w:rFonts w:ascii="Cambria Math" w:hAnsi="Cambria Math"/>
-                    </w:rPr>
-                    <m:t>, i</m:t>
+                    <m:t>w, i</m:t>
                   </m:r>
                 </m:sub>
               </m:sSub>
@@ -9636,13 +9738,7 @@
                 <w:rPr>
                   <w:rFonts w:ascii="Cambria Math" w:eastAsiaTheme="minorEastAsia" w:hAnsi="Cambria Math"/>
                 </w:rPr>
-                <m:t>w</m:t>
-              </m:r>
-              <m:r>
-                <w:rPr>
-                  <w:rFonts w:ascii="Cambria Math" w:eastAsiaTheme="minorEastAsia" w:hAnsi="Cambria Math"/>
-                </w:rPr>
-                <m:t>,i</m:t>
+                <m:t>w,i</m:t>
               </m:r>
             </m:sub>
           </m:sSub>
@@ -9684,13 +9780,7 @@
                     <w:rPr>
                       <w:rFonts w:ascii="Cambria Math" w:eastAsiaTheme="minorEastAsia" w:hAnsi="Cambria Math"/>
                     </w:rPr>
-                    <m:t>w</m:t>
-                  </m:r>
-                  <m:r>
-                    <w:rPr>
-                      <w:rFonts w:ascii="Cambria Math" w:eastAsiaTheme="minorEastAsia" w:hAnsi="Cambria Math"/>
-                    </w:rPr>
-                    <m:t>,i</m:t>
+                    <m:t>w,i</m:t>
                   </m:r>
                 </m:sub>
               </m:sSub>
@@ -9799,13 +9889,7 @@
                     <w:rPr>
                       <w:rFonts w:ascii="Cambria Math" w:hAnsi="Cambria Math"/>
                     </w:rPr>
-                    <m:t>w</m:t>
-                  </m:r>
-                  <m:r>
-                    <w:rPr>
-                      <w:rFonts w:ascii="Cambria Math" w:hAnsi="Cambria Math"/>
-                    </w:rPr>
-                    <m:t>,  b</m:t>
+                    <m:t>w,  b</m:t>
                   </m:r>
                 </m:sub>
               </m:sSub>
@@ -9847,13 +9931,7 @@
                         <w:rPr>
                           <w:rFonts w:ascii="Cambria Math" w:eastAsiaTheme="minorEastAsia" w:hAnsi="Cambria Math"/>
                         </w:rPr>
-                        <m:t>w</m:t>
-                      </m:r>
-                      <m:r>
-                        <w:rPr>
-                          <w:rFonts w:ascii="Cambria Math" w:eastAsiaTheme="minorEastAsia" w:hAnsi="Cambria Math"/>
-                        </w:rPr>
-                        <m:t>,i</m:t>
+                        <m:t>w,i</m:t>
                       </m:r>
                     </m:sub>
                   </m:sSub>
@@ -9984,13 +10062,7 @@
                     <w:rPr>
                       <w:rFonts w:ascii="Cambria Math" w:hAnsi="Cambria Math"/>
                     </w:rPr>
-                    <m:t>w</m:t>
-                  </m:r>
-                  <m:r>
-                    <w:rPr>
-                      <w:rFonts w:ascii="Cambria Math" w:hAnsi="Cambria Math"/>
-                    </w:rPr>
-                    <m:t>,  b</m:t>
+                    <m:t>w,  b</m:t>
                   </m:r>
                 </m:sub>
               </m:sSub>
@@ -10136,16 +10208,7 @@
                         <w:rPr>
                           <w:rFonts w:ascii="Cambria Math" w:eastAsiaTheme="minorEastAsia" w:hAnsi="Cambria Math"/>
                         </w:rPr>
-                        <m:t>a</m:t>
-                      </m:r>
-                      <m:r>
-                        <m:rPr>
-                          <m:sty m:val="p"/>
-                        </m:rPr>
-                        <w:rPr>
-                          <w:rFonts w:ascii="Cambria Math" w:eastAsiaTheme="minorEastAsia" w:hAnsi="Cambria Math"/>
-                        </w:rPr>
-                        <m:t>,b</m:t>
+                        <m:t>a,b</m:t>
                       </m:r>
                     </m:sub>
                   </m:sSub>
@@ -10369,13 +10432,7 @@
                     <w:rPr>
                       <w:rFonts w:ascii="Cambria Math" w:hAnsi="Cambria Math"/>
                     </w:rPr>
-                    <m:t>w</m:t>
-                  </m:r>
-                  <m:r>
-                    <w:rPr>
-                      <w:rFonts w:ascii="Cambria Math" w:hAnsi="Cambria Math"/>
-                    </w:rPr>
-                    <m:t>,  b</m:t>
+                    <m:t>w,  b</m:t>
                   </m:r>
                 </m:sub>
               </m:sSub>
@@ -10423,16 +10480,7 @@
                         <w:rPr>
                           <w:rFonts w:ascii="Cambria Math" w:eastAsiaTheme="minorEastAsia" w:hAnsi="Cambria Math"/>
                         </w:rPr>
-                        <m:t>w</m:t>
-                      </m:r>
-                      <m:r>
-                        <m:rPr>
-                          <m:sty m:val="p"/>
-                        </m:rPr>
-                        <w:rPr>
-                          <w:rFonts w:ascii="Cambria Math" w:eastAsiaTheme="minorEastAsia" w:hAnsi="Cambria Math"/>
-                        </w:rPr>
-                        <m:t>,b</m:t>
+                        <m:t>w,b</m:t>
                       </m:r>
                     </m:sub>
                   </m:sSub>
@@ -10750,13 +10798,7 @@
                     <w:rPr>
                       <w:rFonts w:ascii="Cambria Math" w:hAnsi="Cambria Math"/>
                     </w:rPr>
-                    <m:t>w</m:t>
-                  </m:r>
-                  <m:r>
-                    <w:rPr>
-                      <w:rFonts w:ascii="Cambria Math" w:hAnsi="Cambria Math"/>
-                    </w:rPr>
-                    <m:t>,  b</m:t>
+                    <m:t>w,  b</m:t>
                   </m:r>
                 </m:sub>
               </m:sSub>
@@ -10804,16 +10846,7 @@
                         <w:rPr>
                           <w:rFonts w:ascii="Cambria Math" w:eastAsiaTheme="minorEastAsia" w:hAnsi="Cambria Math"/>
                         </w:rPr>
-                        <m:t>a</m:t>
-                      </m:r>
-                      <m:r>
-                        <m:rPr>
-                          <m:sty m:val="p"/>
-                        </m:rPr>
-                        <w:rPr>
-                          <w:rFonts w:ascii="Cambria Math" w:eastAsiaTheme="minorEastAsia" w:hAnsi="Cambria Math"/>
-                        </w:rPr>
-                        <m:t>,b</m:t>
+                        <m:t>a,b</m:t>
                       </m:r>
                     </m:sub>
                   </m:sSub>
@@ -12667,8 +12700,17 @@
           <w:rFonts w:eastAsiaTheme="minorEastAsia"/>
           <w:iCs/>
         </w:rPr>
-        <w:t>Can be further rewritten into pH and pKA</w:t>
+        <w:t xml:space="preserve">Can be further rewritten into pH and </w:t>
       </w:r>
+      <w:proofErr w:type="spellStart"/>
+      <w:r>
+        <w:rPr>
+          <w:rFonts w:eastAsiaTheme="minorEastAsia"/>
+          <w:iCs/>
+        </w:rPr>
+        <w:t>pKA</w:t>
+      </w:r>
+      <w:proofErr w:type="spellEnd"/>
     </w:p>
     <w:p>
       <w:pPr>
@@ -13835,7 +13877,21 @@
         <w:rPr>
           <w:iCs/>
         </w:rPr>
-        <w:t>Rewrite with definition of pKa and pH (see 2-film)</w:t>
+        <w:t xml:space="preserve">Rewrite with definition of </w:t>
+      </w:r>
+      <w:proofErr w:type="spellStart"/>
+      <w:r>
+        <w:rPr>
+          <w:iCs/>
+        </w:rPr>
+        <w:t>pKa</w:t>
+      </w:r>
+      <w:proofErr w:type="spellEnd"/>
+      <w:r>
+        <w:rPr>
+          <w:iCs/>
+        </w:rPr>
+        <w:t xml:space="preserve"> and pH (see 2-film)</w:t>
       </w:r>
     </w:p>
     <w:p>
@@ -14628,7 +14684,15 @@
           <w:rFonts w:eastAsiaTheme="minorEastAsia"/>
           <w:iCs/>
         </w:rPr>
-        <w:t>The equilibrium temperature dependent, but will just quickly apply the pK</w:t>
+        <w:t xml:space="preserve">The equilibrium temperature dependent, but will just quickly apply the </w:t>
+      </w:r>
+      <w:proofErr w:type="spellStart"/>
+      <w:r>
+        <w:rPr>
+          <w:rFonts w:eastAsiaTheme="minorEastAsia"/>
+          <w:iCs/>
+        </w:rPr>
+        <w:t>pK</w:t>
       </w:r>
       <w:r>
         <w:rPr>
@@ -14636,7 +14700,16 @@
           <w:iCs/>
           <w:vertAlign w:val="subscript"/>
         </w:rPr>
-        <w:t xml:space="preserve">a </w:t>
+        <w:t>a</w:t>
+      </w:r>
+      <w:proofErr w:type="spellEnd"/>
+      <w:r>
+        <w:rPr>
+          <w:rFonts w:eastAsiaTheme="minorEastAsia"/>
+          <w:iCs/>
+          <w:vertAlign w:val="subscript"/>
+        </w:rPr>
+        <w:t xml:space="preserve"> </w:t>
       </w:r>
       <w:r>
         <w:rPr>
@@ -15575,7 +15648,7 @@
             <m:sSupPr>
               <m:ctrlPr>
                 <w:rPr>
-                  <w:rFonts w:ascii="Cambria Math"/>
+                  <w:rFonts w:ascii="Cambria Math" w:hAnsi="Cambria Math"/>
                 </w:rPr>
               </m:ctrlPr>
             </m:sSupPr>
@@ -15615,7 +15688,7 @@
             <m:sSupPr>
               <m:ctrlPr>
                 <w:rPr>
-                  <w:rFonts w:ascii="Cambria Math"/>
+                  <w:rFonts w:ascii="Cambria Math" w:hAnsi="Cambria Math"/>
                 </w:rPr>
               </m:ctrlPr>
             </m:sSupPr>
@@ -16011,7 +16084,7 @@
             <m:sSupPr>
               <m:ctrlPr>
                 <w:rPr>
-                  <w:rFonts w:ascii="Cambria Math"/>
+                  <w:rFonts w:ascii="Cambria Math" w:hAnsi="Cambria Math"/>
                 </w:rPr>
               </m:ctrlPr>
             </m:sSupPr>
@@ -16048,7 +16121,7 @@
             <m:sSupPr>
               <m:ctrlPr>
                 <w:rPr>
-                  <w:rFonts w:ascii="Cambria Math"/>
+                  <w:rFonts w:ascii="Cambria Math" w:hAnsi="Cambria Math"/>
                   <w:i/>
                 </w:rPr>
               </m:ctrlPr>
@@ -16273,7 +16346,7 @@
                 <m:sSupPr>
                   <m:ctrlPr>
                     <w:rPr>
-                      <w:rFonts w:ascii="Cambria Math"/>
+                      <w:rFonts w:ascii="Cambria Math" w:hAnsi="Cambria Math"/>
                       <w:iCs/>
                     </w:rPr>
                   </m:ctrlPr>

</xml_diff>